<commit_message>
docs: align report sprint dates with October weekends
</commit_message>
<xml_diff>
--- a/output/docx/Sprawozdanie-Zaliczone.docx
+++ b/output/docx/Sprawozdanie-Zaliczone.docx
@@ -958,7 +958,7 @@
           <w:color w:val="000000"/>
           <w:sz w:val="24"/>
         </w:rPr>
-        <w:t>MVP obejmuje dodawanie i usuwanie przedmiotów, terminy, zadania, filtrowanie, postęp oraz kopię JSON. Dane są lokalne; produkt nie wymaga konta. Pracę planujemy w Scrumie z tablicą Kanban, w dwóch tygodniowych sprintach. Krótki cykl pozwala najpierw dostarczyć rdzeń planera, a następnie dopracować ochronę danych i wygodę obsługi.</w:t>
+        <w:t>MVP obejmuje dodawanie i usuwanie przedmiotów, terminy, zadania, filtrowanie, postęp oraz kopię JSON. Dane są lokalne; produkt nie wymaga konta. Pracę planujemy w Scrumie z tablicą Kanban, w dwóch weekendowych sprintach: 17–18 i 24–25 października 2026. Krótki cykl pozwala najpierw dostarczyć rdzeń planera, a następnie dopracować ochronę danych i wygodę obsługi.</w:t>
       </w:r>
     </w:p>
     <w:p>
@@ -4329,7 +4329,7 @@
               </w:rPr>
               <w:t>1</w:t>
               <w:br/>
-              <w:t>26.10–01.11.2026</w:t>
+              <w:t>17–18.10.2026</w:t>
             </w:r>
           </w:p>
         </w:tc>
@@ -4402,7 +4402,7 @@
               </w:rPr>
               <w:t>2</w:t>
               <w:br/>
-              <w:t>02.11–08.11.2026</w:t>
+              <w:t>24–25.10.2026</w:t>
             </w:r>
           </w:p>
         </w:tc>
@@ -10114,7 +10114,7 @@
           <w:color w:val="000000"/>
           <w:sz w:val="23"/>
         </w:rPr>
-        <w:t>Poniższe notatki, wypowiedzi i feedback są opracowaną symulacją dydaktyczną dwóch sprintów. Pokazują pracę czterech ról, zgłaszane trudności oraz konkretne ustalenia. Zapis jest skrócony do informacji potrzebnych do prowadzenia projektu.</w:t>
+        <w:t>Poniższe notatki, wypowiedzi i feedback są symulacją dydaktyczną weekendów 17–18 i 24–25.10.2026. Pokazują pracę czterech ról i ustalenia. Na dzień 24.10 zapisy na 25.10 są planowanym scenariuszem, a nie relacją z odbytych spotkań.</w:t>
       </w:r>
     </w:p>
     <w:p>
@@ -10132,7 +10132,7 @@
           <w:color w:val="000000"/>
           <w:sz w:val="23"/>
         </w:rPr>
-        <w:t>Sprint 1  Planowanie  26.10.2026  18.00</w:t>
+        <w:t>Sprint 1  Planowanie  17.10.2026  09.00</w:t>
       </w:r>
     </w:p>
     <w:p>
@@ -10270,7 +10270,7 @@
           <w:color w:val="000000"/>
           <w:sz w:val="23"/>
         </w:rPr>
-        <w:t>Sprint 1  Daily Scrum  28.10.2026  20.00</w:t>
+        <w:t>Sprint 1  Daily Scrum  18.10.2026  10.00</w:t>
       </w:r>
     </w:p>
     <w:p>
@@ -10408,7 +10408,7 @@
           <w:color w:val="000000"/>
           <w:sz w:val="23"/>
         </w:rPr>
-        <w:t>Sprint 1  Przegląd  01.11.2026  18.30</w:t>
+        <w:t>Sprint 1  Przegląd  18.10.2026  18.30</w:t>
       </w:r>
     </w:p>
     <w:p>
@@ -10546,7 +10546,7 @@
           <w:color w:val="000000"/>
           <w:sz w:val="23"/>
         </w:rPr>
-        <w:t>Sprint 1  Retrospektywa 4Ls  01.11.2026  19.00</w:t>
+        <w:t>Sprint 1  Retrospektywa 4Ls  18.10.2026  19.00</w:t>
       </w:r>
     </w:p>
     <w:p>
@@ -10702,7 +10702,7 @@
           <w:color w:val="000000"/>
           <w:sz w:val="23"/>
         </w:rPr>
-        <w:t>Sprint 2  Planowanie  02.11.2026  18.00</w:t>
+        <w:t>Sprint 2  Planowanie  24.10.2026  09.00</w:t>
       </w:r>
     </w:p>
     <w:p>
@@ -10840,7 +10840,7 @@
           <w:color w:val="000000"/>
           <w:sz w:val="23"/>
         </w:rPr>
-        <w:t>Sprint 2  Daily Scrum  04.11.2026  20.00</w:t>
+        <w:t>Sprint 2  Daily Scrum  25.10.2026  10.00  plan</w:t>
       </w:r>
     </w:p>
     <w:p>
@@ -10978,7 +10978,7 @@
           <w:color w:val="000000"/>
           <w:sz w:val="23"/>
         </w:rPr>
-        <w:t>Sprint 2  Przegląd  08.11.2026  18.30</w:t>
+        <w:t>Sprint 2  Przegląd  25.10.2026  18.30  plan</w:t>
       </w:r>
     </w:p>
     <w:p>
@@ -11116,7 +11116,7 @@
           <w:color w:val="000000"/>
           <w:sz w:val="23"/>
         </w:rPr>
-        <w:t>Sprint 2  Retrospektywa 4Ls  08.11.2026  19.00</w:t>
+        <w:t>Sprint 2  Retrospektywa 4Ls  25.10.2026  19.00  plan</w:t>
       </w:r>
     </w:p>
     <w:p>
@@ -11252,7 +11252,7 @@
           <w:color w:val="000000"/>
           <w:sz w:val="23"/>
         </w:rPr>
-        <w:t>Raport iteracji: zakres 19 SP zakończono w scenariuszu ćwiczenia. Najważniejszą zmianą procesu było domykanie błędów przed rozpoczęciem nowej pracy oraz sprawdzanie kopii i klawiatury jako części zwykłego odbioru.</w:t>
+        <w:t>Planowane zamknięcie iteracji 25.10: 19 SP w scenariuszu ćwiczenia. Usprawnienia obejmują domykanie błędów przed nową pracą oraz sprawdzanie kopii i klawiatury w zwykłym odbiorze. Rzeczywisty wynik kontroli z 24.10 opisuje rozdział o testach.</w:t>
       </w:r>
     </w:p>
     <w:p>

</xml_diff>

<commit_message>
docs: align report sprint dates with October weekends (#22)
</commit_message>
<xml_diff>
--- a/output/docx/Sprawozdanie-Zaliczone.docx
+++ b/output/docx/Sprawozdanie-Zaliczone.docx
@@ -958,7 +958,7 @@
           <w:color w:val="000000"/>
           <w:sz w:val="24"/>
         </w:rPr>
-        <w:t>MVP obejmuje dodawanie i usuwanie przedmiotów, terminy, zadania, filtrowanie, postęp oraz kopię JSON. Dane są lokalne; produkt nie wymaga konta. Pracę planujemy w Scrumie z tablicą Kanban, w dwóch tygodniowych sprintach. Krótki cykl pozwala najpierw dostarczyć rdzeń planera, a następnie dopracować ochronę danych i wygodę obsługi.</w:t>
+        <w:t>MVP obejmuje dodawanie i usuwanie przedmiotów, terminy, zadania, filtrowanie, postęp oraz kopię JSON. Dane są lokalne; produkt nie wymaga konta. Pracę planujemy w Scrumie z tablicą Kanban, w dwóch weekendowych sprintach: 17–18 i 24–25 października 2026. Krótki cykl pozwala najpierw dostarczyć rdzeń planera, a następnie dopracować ochronę danych i wygodę obsługi.</w:t>
       </w:r>
     </w:p>
     <w:p>
@@ -4329,7 +4329,7 @@
               </w:rPr>
               <w:t>1</w:t>
               <w:br/>
-              <w:t>26.10–01.11.2026</w:t>
+              <w:t>17–18.10.2026</w:t>
             </w:r>
           </w:p>
         </w:tc>
@@ -4402,7 +4402,7 @@
               </w:rPr>
               <w:t>2</w:t>
               <w:br/>
-              <w:t>02.11–08.11.2026</w:t>
+              <w:t>24–25.10.2026</w:t>
             </w:r>
           </w:p>
         </w:tc>
@@ -10114,7 +10114,7 @@
           <w:color w:val="000000"/>
           <w:sz w:val="23"/>
         </w:rPr>
-        <w:t>Poniższe notatki, wypowiedzi i feedback są opracowaną symulacją dydaktyczną dwóch sprintów. Pokazują pracę czterech ról, zgłaszane trudności oraz konkretne ustalenia. Zapis jest skrócony do informacji potrzebnych do prowadzenia projektu.</w:t>
+        <w:t>Poniższe notatki, wypowiedzi i feedback są symulacją dydaktyczną weekendów 17–18 i 24–25.10.2026. Pokazują pracę czterech ról i ustalenia. Na dzień 24.10 zapisy na 25.10 są planowanym scenariuszem, a nie relacją z odbytych spotkań.</w:t>
       </w:r>
     </w:p>
     <w:p>
@@ -10132,7 +10132,7 @@
           <w:color w:val="000000"/>
           <w:sz w:val="23"/>
         </w:rPr>
-        <w:t>Sprint 1  Planowanie  26.10.2026  18.00</w:t>
+        <w:t>Sprint 1  Planowanie  17.10.2026  09.00</w:t>
       </w:r>
     </w:p>
     <w:p>
@@ -10270,7 +10270,7 @@
           <w:color w:val="000000"/>
           <w:sz w:val="23"/>
         </w:rPr>
-        <w:t>Sprint 1  Daily Scrum  28.10.2026  20.00</w:t>
+        <w:t>Sprint 1  Daily Scrum  18.10.2026  10.00</w:t>
       </w:r>
     </w:p>
     <w:p>
@@ -10408,7 +10408,7 @@
           <w:color w:val="000000"/>
           <w:sz w:val="23"/>
         </w:rPr>
-        <w:t>Sprint 1  Przegląd  01.11.2026  18.30</w:t>
+        <w:t>Sprint 1  Przegląd  18.10.2026  18.30</w:t>
       </w:r>
     </w:p>
     <w:p>
@@ -10546,7 +10546,7 @@
           <w:color w:val="000000"/>
           <w:sz w:val="23"/>
         </w:rPr>
-        <w:t>Sprint 1  Retrospektywa 4Ls  01.11.2026  19.00</w:t>
+        <w:t>Sprint 1  Retrospektywa 4Ls  18.10.2026  19.00</w:t>
       </w:r>
     </w:p>
     <w:p>
@@ -10702,7 +10702,7 @@
           <w:color w:val="000000"/>
           <w:sz w:val="23"/>
         </w:rPr>
-        <w:t>Sprint 2  Planowanie  02.11.2026  18.00</w:t>
+        <w:t>Sprint 2  Planowanie  24.10.2026  09.00</w:t>
       </w:r>
     </w:p>
     <w:p>
@@ -10840,7 +10840,7 @@
           <w:color w:val="000000"/>
           <w:sz w:val="23"/>
         </w:rPr>
-        <w:t>Sprint 2  Daily Scrum  04.11.2026  20.00</w:t>
+        <w:t>Sprint 2  Daily Scrum  25.10.2026  10.00  plan</w:t>
       </w:r>
     </w:p>
     <w:p>
@@ -10978,7 +10978,7 @@
           <w:color w:val="000000"/>
           <w:sz w:val="23"/>
         </w:rPr>
-        <w:t>Sprint 2  Przegląd  08.11.2026  18.30</w:t>
+        <w:t>Sprint 2  Przegląd  25.10.2026  18.30  plan</w:t>
       </w:r>
     </w:p>
     <w:p>
@@ -11116,7 +11116,7 @@
           <w:color w:val="000000"/>
           <w:sz w:val="23"/>
         </w:rPr>
-        <w:t>Sprint 2  Retrospektywa 4Ls  08.11.2026  19.00</w:t>
+        <w:t>Sprint 2  Retrospektywa 4Ls  25.10.2026  19.00  plan</w:t>
       </w:r>
     </w:p>
     <w:p>
@@ -11252,7 +11252,7 @@
           <w:color w:val="000000"/>
           <w:sz w:val="23"/>
         </w:rPr>
-        <w:t>Raport iteracji: zakres 19 SP zakończono w scenariuszu ćwiczenia. Najważniejszą zmianą procesu było domykanie błędów przed rozpoczęciem nowej pracy oraz sprawdzanie kopii i klawiatury jako części zwykłego odbioru.</w:t>
+        <w:t>Planowane zamknięcie iteracji 25.10: 19 SP w scenariuszu ćwiczenia. Usprawnienia obejmują domykanie błędów przed nową pracą oraz sprawdzanie kopii i klawiatury w zwykłym odbiorze. Rzeczywisty wynik kontroli z 24.10 opisuje rozdział o testach.</w:t>
       </w:r>
     </w:p>
     <w:p>

</xml_diff>